<commit_message>
Résumé docx: add Availability block to fill sidebar whitespace
Below Skills/Certifications: Availability (graduating Dec 2026, open to
UX & front-end roles, Bloomington/remote) above Off the Clock. Balances
the right column; still one page, fonts embedded. Synced the served
public/ copy for the site's Word download.
</commit_message>
<xml_diff>
--- a/public/Gabriel-Harlan-Resume.docx
+++ b/public/Gabriel-Harlan-Resume.docx
@@ -1108,6 +1108,109 @@
                 <w:rFonts w:ascii="Space Mono" w:hAnsi="Space Mono"/>
                 <w:b/>
                 <w:i w:val="0"/>
+                <w:color w:val="C08800"/>
+                <w:sz w:val="18"/>
+              </w:rPr>
+              <w:t xml:space="preserve">■ </w:t>
+            </w:r>
+            <w:r>
+              <w:rPr>
+                <w:rFonts w:ascii="Space Mono" w:hAnsi="Space Mono"/>
+                <w:b/>
+                <w:i w:val="0"/>
+                <w:color w:val="211B14"/>
+                <w:sz w:val="18"/>
+              </w:rPr>
+              <w:t>AVAILABILITY</w:t>
+            </w:r>
+          </w:p>
+          <w:p>
+            <w:pPr>
+              <w:spacing w:after="30"/>
+              <w:ind w:left="230" w:hanging="230"/>
+            </w:pPr>
+            <w:r>
+              <w:rPr>
+                <w:rFonts w:ascii="Schibsted Grotesk" w:hAnsi="Schibsted Grotesk"/>
+                <w:b w:val="0"/>
+                <w:i w:val="0"/>
+                <w:color w:val="C08800"/>
+                <w:sz w:val="14"/>
+              </w:rPr>
+              <w:t xml:space="preserve">◆  </w:t>
+            </w:r>
+            <w:r>
+              <w:rPr>
+                <w:rFonts w:ascii="Schibsted Grotesk" w:hAnsi="Schibsted Grotesk"/>
+                <w:b w:val="0"/>
+                <w:i w:val="0"/>
+                <w:color w:val="5A4F41"/>
+                <w:sz w:val="18"/>
+              </w:rPr>
+              <w:t>Graduating December 2026</w:t>
+            </w:r>
+          </w:p>
+          <w:p>
+            <w:pPr>
+              <w:spacing w:after="30"/>
+              <w:ind w:left="230" w:hanging="230"/>
+            </w:pPr>
+            <w:r>
+              <w:rPr>
+                <w:rFonts w:ascii="Schibsted Grotesk" w:hAnsi="Schibsted Grotesk"/>
+                <w:b w:val="0"/>
+                <w:i w:val="0"/>
+                <w:color w:val="C08800"/>
+                <w:sz w:val="14"/>
+              </w:rPr>
+              <w:t xml:space="preserve">◆  </w:t>
+            </w:r>
+            <w:r>
+              <w:rPr>
+                <w:rFonts w:ascii="Schibsted Grotesk" w:hAnsi="Schibsted Grotesk"/>
+                <w:b w:val="0"/>
+                <w:i w:val="0"/>
+                <w:color w:val="5A4F41"/>
+                <w:sz w:val="18"/>
+              </w:rPr>
+              <w:t>Open to UX &amp; front-end roles</w:t>
+            </w:r>
+          </w:p>
+          <w:p>
+            <w:pPr>
+              <w:spacing w:after="30"/>
+              <w:ind w:left="230" w:hanging="230"/>
+            </w:pPr>
+            <w:r>
+              <w:rPr>
+                <w:rFonts w:ascii="Schibsted Grotesk" w:hAnsi="Schibsted Grotesk"/>
+                <w:b w:val="0"/>
+                <w:i w:val="0"/>
+                <w:color w:val="C08800"/>
+                <w:sz w:val="14"/>
+              </w:rPr>
+              <w:t xml:space="preserve">◆  </w:t>
+            </w:r>
+            <w:r>
+              <w:rPr>
+                <w:rFonts w:ascii="Schibsted Grotesk" w:hAnsi="Schibsted Grotesk"/>
+                <w:b w:val="0"/>
+                <w:i w:val="0"/>
+                <w:color w:val="5A4F41"/>
+                <w:sz w:val="18"/>
+              </w:rPr>
+              <w:t>Bloomington, IN · open to remote</w:t>
+            </w:r>
+          </w:p>
+          <w:p>
+            <w:pPr>
+              <w:spacing w:before="180" w:after="60"/>
+            </w:pPr>
+            <w:r>
+              <w:rPr>
+                <w:rFonts w:ascii="Space Mono" w:hAnsi="Space Mono"/>
+                <w:b/>
+                <w:i w:val="0"/>
                 <w:color w:val="D8539B"/>
                 <w:sz w:val="18"/>
               </w:rPr>

</xml_diff>

<commit_message>
Add TRACI SMS Gateway case study; resume reflect; keymap + download tweaks
- New case study for the Tire Rack TRACI SMS gateway (Python/FastAPI on
  Cloud Run fronting the AI agent via Twilio; text-driven vehicle picker,
  event→SMS renderer, async workers, Redis/SQS, keyless CI/CD). Private
  repo, so no live link; kept high-level (no internal endpoints/keys).
  Added project card + request-flow diagram.
- Résumé: TRACI SMS Gateway leads the sidebar Projects (swapped Blenz out
  to keep one page) in both HTML/PDF and the Word doc.
- Résumé page: force PDF/Word buttons to download (blob) rather than open.
- Corne keymap: rotary encoder → page up/down; thumb GUI key → play/pause.

Co-Authored-By: Claude Opus 4.8 (1M context) <noreply@anthropic.com>
</commit_message>
<xml_diff>
--- a/public/Gabriel-Harlan-Resume.docx
+++ b/public/Gabriel-Harlan-Resume.docx
@@ -1147,6 +1147,42 @@
                 <w:color w:val="211B14"/>
                 <w:sz w:val="18"/>
               </w:rPr>
+              <w:t>TRACI SMS Gateway</w:t>
+            </w:r>
+            <w:r>
+              <w:rPr>
+                <w:rFonts w:ascii="Schibsted Grotesk" w:hAnsi="Schibsted Grotesk"/>
+                <w:b w:val="0"/>
+                <w:i w:val="0"/>
+                <w:color w:val="5A4F41"/>
+                <w:sz w:val="17"/>
+              </w:rPr>
+              <w:t xml:space="preserve"> — text Tire Rack’s AI agent — FastAPI · Cloud Run · Twilio</w:t>
+            </w:r>
+          </w:p>
+          <w:p>
+            <w:pPr>
+              <w:spacing w:after="50"/>
+              <w:ind w:left="230" w:hanging="230"/>
+            </w:pPr>
+            <w:r>
+              <w:rPr>
+                <w:rFonts w:ascii="Schibsted Grotesk" w:hAnsi="Schibsted Grotesk"/>
+                <w:b w:val="0"/>
+                <w:i w:val="0"/>
+                <w:color w:val="C08800"/>
+                <w:sz w:val="14"/>
+              </w:rPr>
+              <w:t xml:space="preserve">◆  </w:t>
+            </w:r>
+            <w:r>
+              <w:rPr>
+                <w:rFonts w:ascii="Schibsted Grotesk" w:hAnsi="Schibsted Grotesk"/>
+                <w:b/>
+                <w:i w:val="0"/>
+                <w:color w:val="211B14"/>
+                <w:sz w:val="18"/>
+              </w:rPr>
               <w:t>Karst</w:t>
             </w:r>
             <w:r>
@@ -1230,42 +1266,6 @@
                 <w:sz w:val="17"/>
               </w:rPr>
               <w:t xml:space="preserve"> — hand-built split wireless keyboard (ZMK)</w:t>
-            </w:r>
-          </w:p>
-          <w:p>
-            <w:pPr>
-              <w:spacing w:after="50"/>
-              <w:ind w:left="230" w:hanging="230"/>
-            </w:pPr>
-            <w:r>
-              <w:rPr>
-                <w:rFonts w:ascii="Schibsted Grotesk" w:hAnsi="Schibsted Grotesk"/>
-                <w:b w:val="0"/>
-                <w:i w:val="0"/>
-                <w:color w:val="C08800"/>
-                <w:sz w:val="14"/>
-              </w:rPr>
-              <w:t xml:space="preserve">◆  </w:t>
-            </w:r>
-            <w:r>
-              <w:rPr>
-                <w:rFonts w:ascii="Schibsted Grotesk" w:hAnsi="Schibsted Grotesk"/>
-                <w:b/>
-                <w:i w:val="0"/>
-                <w:color w:val="211B14"/>
-                <w:sz w:val="18"/>
-              </w:rPr>
-              <w:t>Blenz</w:t>
-            </w:r>
-            <w:r>
-              <w:rPr>
-                <w:rFonts w:ascii="Schibsted Grotesk" w:hAnsi="Schibsted Grotesk"/>
-                <w:b w:val="0"/>
-                <w:i w:val="0"/>
-                <w:color w:val="5A4F41"/>
-                <w:sz w:val="17"/>
-              </w:rPr>
-              <w:t xml:space="preserve"> — responsive NSS cave-preserve site</w:t>
             </w:r>
           </w:p>
           <w:p>

</xml_diff>

<commit_message>
resume: add TRACTION (experience + projects) and ITIT (education); consolidate intern bullets; intern dates Jun–Aug 2026; drop Corne; refit to one page
Co-Authored-By: Claude Opus 4.8 (1M context) <noreply@anthropic.com>
</commit_message>
<xml_diff>
--- a/public/Gabriel-Harlan-Resume.docx
+++ b/public/Gabriel-Harlan-Resume.docx
@@ -88,7 +88,7 @@
           </w:tcPr>
           <w:p>
             <w:pPr>
-              <w:spacing w:after="0" w:line="276" w:lineRule="auto"/>
+              <w:spacing w:after="0" w:line="240" w:lineRule="auto"/>
               <w:jc w:val="right"/>
             </w:pPr>
             <w:r>
@@ -104,7 +104,7 @@
           </w:p>
           <w:p>
             <w:pPr>
-              <w:spacing w:after="0" w:line="276" w:lineRule="auto"/>
+              <w:spacing w:after="0" w:line="240" w:lineRule="auto"/>
               <w:jc w:val="right"/>
             </w:pPr>
             <w:r>
@@ -120,7 +120,7 @@
           </w:p>
           <w:p>
             <w:pPr>
-              <w:spacing w:after="0" w:line="276" w:lineRule="auto"/>
+              <w:spacing w:after="0" w:line="240" w:lineRule="auto"/>
               <w:jc w:val="right"/>
             </w:pPr>
             <w:r>
@@ -136,7 +136,7 @@
           </w:p>
           <w:p>
             <w:pPr>
-              <w:spacing w:after="0" w:line="276" w:lineRule="auto"/>
+              <w:spacing w:after="0" w:line="240" w:lineRule="auto"/>
               <w:jc w:val="right"/>
             </w:pPr>
             <w:r>
@@ -152,7 +152,7 @@
           </w:p>
           <w:p>
             <w:pPr>
-              <w:spacing w:after="0" w:line="276" w:lineRule="auto"/>
+              <w:spacing w:after="0" w:line="240" w:lineRule="auto"/>
               <w:jc w:val="right"/>
             </w:pPr>
             <w:r>
@@ -171,7 +171,7 @@
     </w:tbl>
     <w:p>
       <w:pPr>
-        <w:spacing w:after="120" w:line="240" w:lineRule="auto"/>
+        <w:spacing w:after="26" w:line="240" w:lineRule="auto"/>
       </w:pPr>
       <w:r>
         <w:rPr>
@@ -212,7 +212,7 @@
           </w:tcPr>
           <w:p>
             <w:pPr>
-              <w:spacing w:before="180" w:after="60"/>
+              <w:spacing w:before="64" w:after="26"/>
             </w:pPr>
             <w:r>
               <w:rPr>
@@ -240,7 +240,7 @@
               <w:tabs>
                 <w:tab w:pos="6235" w:val="right"/>
               </w:tabs>
-              <w:spacing w:before="80"/>
+              <w:spacing w:before="36"/>
             </w:pPr>
             <w:r>
               <w:rPr>
@@ -296,7 +296,7 @@
           </w:p>
           <w:p>
             <w:pPr>
-              <w:spacing w:before="40"/>
+              <w:spacing w:before="28"/>
             </w:pPr>
             <w:r>
               <w:rPr>
@@ -321,10 +321,36 @@
           </w:p>
           <w:p>
             <w:pPr>
+              <w:spacing w:after="18"/>
+              <w:ind w:left="230" w:hanging="230"/>
+            </w:pPr>
+            <w:r>
+              <w:rPr>
+                <w:rFonts w:ascii="Schibsted Grotesk" w:hAnsi="Schibsted Grotesk"/>
+                <w:b w:val="0"/>
+                <w:i w:val="0"/>
+                <w:color w:val="F4502A"/>
+                <w:sz w:val="14"/>
+              </w:rPr>
+              <w:t xml:space="preserve">◆  </w:t>
+            </w:r>
+            <w:r>
+              <w:rPr>
+                <w:rFonts w:ascii="Schibsted Grotesk" w:hAnsi="Schibsted Grotesk"/>
+                <w:b w:val="0"/>
+                <w:i w:val="0"/>
+                <w:color w:val="5A4F41"/>
+                <w:sz w:val="18"/>
+              </w:rPr>
+              <w:t>ITIT — senior capstone: an IoT asset-tracking system that keeps hardware trackers and a web app in real-time sync, with a nested Deployments → Locations → Trackers → Items data model and CSV export to Excel.</w:t>
+            </w:r>
+          </w:p>
+          <w:p>
+            <w:pPr>
               <w:tabs>
                 <w:tab w:pos="6235" w:val="right"/>
               </w:tabs>
-              <w:spacing w:before="80"/>
+              <w:spacing w:before="36"/>
             </w:pPr>
             <w:r>
               <w:rPr>
@@ -380,7 +406,7 @@
           </w:p>
           <w:p>
             <w:pPr>
-              <w:spacing w:after="30"/>
+              <w:spacing w:after="18"/>
               <w:ind w:left="230" w:hanging="230"/>
             </w:pPr>
             <w:r>
@@ -406,7 +432,7 @@
           </w:p>
           <w:p>
             <w:pPr>
-              <w:spacing w:before="180" w:after="60"/>
+              <w:spacing w:before="64" w:after="26"/>
             </w:pPr>
             <w:r>
               <w:rPr>
@@ -431,7 +457,7 @@
           </w:p>
           <w:p>
             <w:pPr>
-              <w:spacing w:before="80" w:after="40"/>
+              <w:spacing w:before="36" w:after="26"/>
             </w:pPr>
             <w:r>
               <w:rPr>
@@ -449,7 +475,7 @@
               <w:tabs>
                 <w:tab w:pos="6235" w:val="right"/>
               </w:tabs>
-              <w:spacing w:before="80"/>
+              <w:spacing w:before="36"/>
             </w:pPr>
             <w:r>
               <w:rPr>
@@ -470,12 +496,12 @@
                 <w:sz w:val="15"/>
               </w:rPr>
               <w:tab/>
-              <w:t>Jun 2026 – Present</w:t>
+              <w:t>Jun 2026 – Aug 2026</w:t>
             </w:r>
           </w:p>
           <w:p>
             <w:pPr>
-              <w:spacing w:after="30"/>
+              <w:spacing w:after="18"/>
               <w:ind w:left="230" w:hanging="230"/>
             </w:pPr>
             <w:r>
@@ -496,12 +522,12 @@
                 <w:color w:val="5A4F41"/>
                 <w:sz w:val="18"/>
               </w:rPr>
-              <w:t>Designed, built, and deployed a production SMS gateway (Python / FastAPI on Cloud Run) that lets customers text Tire Rack's TRACI AI agent — inbound webhook → async worker → agent call → replies rendered into SMS via Twilio; backed by Redis/SQS, STOP/HELP opt-out compliance, 90 tests, and keyless CI/CD.</w:t>
+              <w:t>Designed and prototyped TRACTION, a sales-enablement rep console — an engine scores customers on LTV × churn × signal recency into a suppression-filtered, frequency-capped daily queue, pairing each lead with a why-now reason, cross-channel history, and an AI-matched cart.</w:t>
             </w:r>
           </w:p>
           <w:p>
             <w:pPr>
-              <w:spacing w:after="30"/>
+              <w:spacing w:after="18"/>
               <w:ind w:left="230" w:hanging="230"/>
             </w:pPr>
             <w:r>
@@ -522,12 +548,12 @@
                 <w:color w:val="5A4F41"/>
                 <w:sz w:val="18"/>
               </w:rPr>
-              <w:t>Cracked its core blocker — the web-only vehicle picker can't render over SMS — with a numbered year/make/model drill-down over the site's YMMV APIs that auto-supplies the factory tire size.</w:t>
+              <w:t>Built and shipped a production SMS gateway (Python / FastAPI on Cloud Run) that lets customers text Tire Rack's TRACI AI agent — webhook → async worker → agent → Twilio SMS, with Redis/SQS, STOP/HELP compliance, 90 tests, and keyless CI/CD; solved the web-only vehicle picker with a numbered YMMV drill-down that auto-supplies factory tire size.</w:t>
             </w:r>
           </w:p>
           <w:p>
             <w:pPr>
-              <w:spacing w:after="30"/>
+              <w:spacing w:after="18"/>
               <w:ind w:left="230" w:hanging="230"/>
             </w:pPr>
             <w:r>
@@ -548,12 +574,12 @@
                 <w:color w:val="5A4F41"/>
                 <w:sz w:val="18"/>
               </w:rPr>
-              <w:t>Built Karst, a Next.js + Firebase caving field-guide app (web + Android) with a privacy-first map — shipped fast with AI-assisted development.</w:t>
+              <w:t>Built Karst, a Next.js + Firebase caving field guide (web + Android) with a privacy-first map — shipped fast with AI-assisted development.</w:t>
             </w:r>
           </w:p>
           <w:p>
             <w:pPr>
-              <w:spacing w:before="80" w:after="40"/>
+              <w:spacing w:before="36" w:after="26"/>
             </w:pPr>
             <w:r>
               <w:rPr>
@@ -571,7 +597,7 @@
               <w:tabs>
                 <w:tab w:pos="6235" w:val="right"/>
               </w:tabs>
-              <w:spacing w:before="80"/>
+              <w:spacing w:before="36"/>
             </w:pPr>
             <w:r>
               <w:rPr>
@@ -597,7 +623,7 @@
           </w:p>
           <w:p>
             <w:pPr>
-              <w:spacing w:after="30"/>
+              <w:spacing w:after="18"/>
               <w:ind w:left="230" w:hanging="230"/>
             </w:pPr>
             <w:r>
@@ -623,7 +649,7 @@
           </w:p>
           <w:p>
             <w:pPr>
-              <w:spacing w:after="30"/>
+              <w:spacing w:after="18"/>
               <w:ind w:left="230" w:hanging="230"/>
             </w:pPr>
             <w:r>
@@ -652,7 +678,7 @@
               <w:tabs>
                 <w:tab w:pos="6235" w:val="right"/>
               </w:tabs>
-              <w:spacing w:before="80"/>
+              <w:spacing w:before="36"/>
             </w:pPr>
             <w:r>
               <w:rPr>
@@ -678,7 +704,7 @@
           </w:p>
           <w:p>
             <w:pPr>
-              <w:spacing w:after="30"/>
+              <w:spacing w:after="18"/>
               <w:ind w:left="230" w:hanging="230"/>
             </w:pPr>
             <w:r>
@@ -707,7 +733,7 @@
               <w:tabs>
                 <w:tab w:pos="6235" w:val="right"/>
               </w:tabs>
-              <w:spacing w:before="80"/>
+              <w:spacing w:before="36"/>
             </w:pPr>
             <w:r>
               <w:rPr>
@@ -733,7 +759,7 @@
           </w:p>
           <w:p>
             <w:pPr>
-              <w:spacing w:after="30"/>
+              <w:spacing w:after="18"/>
               <w:ind w:left="230" w:hanging="230"/>
             </w:pPr>
             <w:r>
@@ -759,7 +785,7 @@
           </w:p>
           <w:p>
             <w:pPr>
-              <w:spacing w:after="30"/>
+              <w:spacing w:after="18"/>
               <w:ind w:left="230" w:hanging="230"/>
             </w:pPr>
             <w:r>
@@ -797,7 +823,7 @@
           </w:tcPr>
           <w:p>
             <w:pPr>
-              <w:spacing w:before="180" w:after="60"/>
+              <w:spacing w:before="64" w:after="26"/>
             </w:pPr>
             <w:r>
               <w:rPr>
@@ -822,7 +848,7 @@
           </w:p>
           <w:p>
             <w:pPr>
-              <w:spacing w:before="60" w:after="0"/>
+              <w:spacing w:before="28" w:after="0"/>
             </w:pPr>
             <w:r>
               <w:rPr>
@@ -852,7 +878,7 @@
           </w:p>
           <w:p>
             <w:pPr>
-              <w:spacing w:before="60" w:after="0"/>
+              <w:spacing w:before="28" w:after="0"/>
             </w:pPr>
             <w:r>
               <w:rPr>
@@ -882,7 +908,7 @@
           </w:p>
           <w:p>
             <w:pPr>
-              <w:spacing w:before="60" w:after="0"/>
+              <w:spacing w:before="28" w:after="0"/>
             </w:pPr>
             <w:r>
               <w:rPr>
@@ -912,7 +938,7 @@
           </w:p>
           <w:p>
             <w:pPr>
-              <w:spacing w:before="60" w:after="0"/>
+              <w:spacing w:before="28" w:after="0"/>
             </w:pPr>
             <w:r>
               <w:rPr>
@@ -942,7 +968,7 @@
           </w:p>
           <w:p>
             <w:pPr>
-              <w:spacing w:before="60" w:after="0"/>
+              <w:spacing w:before="28" w:after="0"/>
             </w:pPr>
             <w:r>
               <w:rPr>
@@ -972,7 +998,7 @@
           </w:p>
           <w:p>
             <w:pPr>
-              <w:spacing w:before="180" w:after="60"/>
+              <w:spacing w:before="64" w:after="26"/>
             </w:pPr>
             <w:r>
               <w:rPr>
@@ -997,7 +1023,7 @@
           </w:p>
           <w:p>
             <w:pPr>
-              <w:spacing w:after="30"/>
+              <w:spacing w:after="18"/>
               <w:ind w:left="230" w:hanging="230"/>
             </w:pPr>
             <w:r>
@@ -1023,7 +1049,7 @@
           </w:p>
           <w:p>
             <w:pPr>
-              <w:spacing w:after="30"/>
+              <w:spacing w:after="18"/>
               <w:ind w:left="230" w:hanging="230"/>
             </w:pPr>
             <w:r>
@@ -1049,7 +1075,7 @@
           </w:p>
           <w:p>
             <w:pPr>
-              <w:spacing w:after="30"/>
+              <w:spacing w:after="18"/>
               <w:ind w:left="230" w:hanging="230"/>
             </w:pPr>
             <w:r>
@@ -1075,7 +1101,7 @@
           </w:p>
           <w:p>
             <w:pPr>
-              <w:spacing w:after="30"/>
+              <w:spacing w:after="18"/>
               <w:ind w:left="230" w:hanging="230"/>
             </w:pPr>
             <w:r>
@@ -1101,7 +1127,7 @@
           </w:p>
           <w:p>
             <w:pPr>
-              <w:spacing w:before="180" w:after="60"/>
+              <w:spacing w:before="64" w:after="26"/>
             </w:pPr>
             <w:r>
               <w:rPr>
@@ -1126,7 +1152,43 @@
           </w:p>
           <w:p>
             <w:pPr>
-              <w:spacing w:after="50"/>
+              <w:spacing w:after="22"/>
+              <w:ind w:left="230" w:hanging="230"/>
+            </w:pPr>
+            <w:r>
+              <w:rPr>
+                <w:rFonts w:ascii="Schibsted Grotesk" w:hAnsi="Schibsted Grotesk"/>
+                <w:b w:val="0"/>
+                <w:i w:val="0"/>
+                <w:color w:val="C08800"/>
+                <w:sz w:val="14"/>
+              </w:rPr>
+              <w:t xml:space="preserve">◆  </w:t>
+            </w:r>
+            <w:r>
+              <w:rPr>
+                <w:rFonts w:ascii="Schibsted Grotesk" w:hAnsi="Schibsted Grotesk"/>
+                <w:b/>
+                <w:i w:val="0"/>
+                <w:color w:val="211B14"/>
+                <w:sz w:val="18"/>
+              </w:rPr>
+              <w:t>TRACTION Rep Console</w:t>
+            </w:r>
+            <w:r>
+              <w:rPr>
+                <w:rFonts w:ascii="Schibsted Grotesk" w:hAnsi="Schibsted Grotesk"/>
+                <w:b w:val="0"/>
+                <w:i w:val="0"/>
+                <w:color w:val="5A4F41"/>
+                <w:sz w:val="17"/>
+              </w:rPr>
+              <w:t xml:space="preserve"> — AI-scored retention queue for Tire Rack reps — UX · Prototype · CRM</w:t>
+            </w:r>
+          </w:p>
+          <w:p>
+            <w:pPr>
+              <w:spacing w:after="22"/>
               <w:ind w:left="230" w:hanging="230"/>
             </w:pPr>
             <w:r>
@@ -1162,7 +1224,7 @@
           </w:p>
           <w:p>
             <w:pPr>
-              <w:spacing w:after="50"/>
+              <w:spacing w:after="22"/>
               <w:ind w:left="230" w:hanging="230"/>
             </w:pPr>
             <w:r>
@@ -1198,79 +1260,7 @@
           </w:p>
           <w:p>
             <w:pPr>
-              <w:spacing w:after="50"/>
-              <w:ind w:left="230" w:hanging="230"/>
-            </w:pPr>
-            <w:r>
-              <w:rPr>
-                <w:rFonts w:ascii="Schibsted Grotesk" w:hAnsi="Schibsted Grotesk"/>
-                <w:b w:val="0"/>
-                <w:i w:val="0"/>
-                <w:color w:val="C08800"/>
-                <w:sz w:val="14"/>
-              </w:rPr>
-              <w:t xml:space="preserve">◆  </w:t>
-            </w:r>
-            <w:r>
-              <w:rPr>
-                <w:rFonts w:ascii="Schibsted Grotesk" w:hAnsi="Schibsted Grotesk"/>
-                <w:b/>
-                <w:i w:val="0"/>
-                <w:color w:val="211B14"/>
-                <w:sz w:val="18"/>
-              </w:rPr>
-              <w:t>ITIT</w:t>
-            </w:r>
-            <w:r>
-              <w:rPr>
-                <w:rFonts w:ascii="Schibsted Grotesk" w:hAnsi="Schibsted Grotesk"/>
-                <w:b w:val="0"/>
-                <w:i w:val="0"/>
-                <w:color w:val="5A4F41"/>
-                <w:sz w:val="17"/>
-              </w:rPr>
-              <w:t xml:space="preserve"> — IoT inventory tracker · senior capstone</w:t>
-            </w:r>
-          </w:p>
-          <w:p>
-            <w:pPr>
-              <w:spacing w:after="50"/>
-              <w:ind w:left="230" w:hanging="230"/>
-            </w:pPr>
-            <w:r>
-              <w:rPr>
-                <w:rFonts w:ascii="Schibsted Grotesk" w:hAnsi="Schibsted Grotesk"/>
-                <w:b w:val="0"/>
-                <w:i w:val="0"/>
-                <w:color w:val="C08800"/>
-                <w:sz w:val="14"/>
-              </w:rPr>
-              <w:t xml:space="preserve">◆  </w:t>
-            </w:r>
-            <w:r>
-              <w:rPr>
-                <w:rFonts w:ascii="Schibsted Grotesk" w:hAnsi="Schibsted Grotesk"/>
-                <w:b/>
-                <w:i w:val="0"/>
-                <w:color w:val="211B14"/>
-                <w:sz w:val="18"/>
-              </w:rPr>
-              <w:t>Corne 42</w:t>
-            </w:r>
-            <w:r>
-              <w:rPr>
-                <w:rFonts w:ascii="Schibsted Grotesk" w:hAnsi="Schibsted Grotesk"/>
-                <w:b w:val="0"/>
-                <w:i w:val="0"/>
-                <w:color w:val="5A4F41"/>
-                <w:sz w:val="17"/>
-              </w:rPr>
-              <w:t xml:space="preserve"> — hand-built split wireless keyboard (ZMK)</w:t>
-            </w:r>
-          </w:p>
-          <w:p>
-            <w:pPr>
-              <w:spacing w:before="180" w:after="60"/>
+              <w:spacing w:before="64" w:after="26"/>
             </w:pPr>
             <w:r>
               <w:rPr>

</xml_diff>

<commit_message>
resume: mirror edits to web version + retitle to UX-Minded Front-End Engineer
Sync the web resume (public/resume/index.html) with the docx/pdf: TRACTION
under the internship + projects, ITIT under Education and kept in projects,
consolidated intern bullets, intern dates Jun–Aug 2026, Corne removed.
Retitle all three artifacts 'Web & UX Designer' -> 'UX-Minded Front-End
Engineer' to match the site.

Co-Authored-By: Claude Opus 4.8 (1M context) <noreply@anthropic.com>
</commit_message>
<xml_diff>
--- a/public/Gabriel-Harlan-Resume.docx
+++ b/public/Gabriel-Harlan-Resume.docx
@@ -71,7 +71,7 @@
                 <w:color w:val="5A4F41"/>
                 <w:sz w:val="17"/>
               </w:rPr>
-              <w:t>Web &amp; UX Designer · Informatics @ Indiana University</w:t>
+              <w:t>UX-Minded Front-End Engineer · Informatics @ Indiana University</w:t>
             </w:r>
           </w:p>
         </w:tc>
@@ -1260,6 +1260,42 @@
           </w:p>
           <w:p>
             <w:pPr>
+              <w:spacing w:after="22"/>
+              <w:ind w:left="230" w:hanging="230"/>
+            </w:pPr>
+            <w:r>
+              <w:rPr>
+                <w:rFonts w:ascii="Schibsted Grotesk" w:hAnsi="Schibsted Grotesk"/>
+                <w:b w:val="0"/>
+                <w:i w:val="0"/>
+                <w:color w:val="C08800"/>
+                <w:sz w:val="14"/>
+              </w:rPr>
+              <w:t xml:space="preserve">◆  </w:t>
+            </w:r>
+            <w:r>
+              <w:rPr>
+                <w:rFonts w:ascii="Schibsted Grotesk" w:hAnsi="Schibsted Grotesk"/>
+                <w:b/>
+                <w:i w:val="0"/>
+                <w:color w:val="211B14"/>
+                <w:sz w:val="18"/>
+              </w:rPr>
+              <w:t>ITIT</w:t>
+            </w:r>
+            <w:r>
+              <w:rPr>
+                <w:rFonts w:ascii="Schibsted Grotesk" w:hAnsi="Schibsted Grotesk"/>
+                <w:b w:val="0"/>
+                <w:i w:val="0"/>
+                <w:color w:val="5A4F41"/>
+                <w:sz w:val="17"/>
+              </w:rPr>
+              <w:t xml:space="preserve"> — IoT inventory tracker · senior capstone</w:t>
+            </w:r>
+          </w:p>
+          <w:p>
+            <w:pPr>
               <w:spacing w:before="64" w:after="26"/>
             </w:pPr>
             <w:r>

</xml_diff>

<commit_message>
resume: fill right column, gap Coursework/ITIT, re-add Corne (rotary encoders)
- Word/PDF: expand right-column spacing so it fills the page (no bottom
  whitespace); shorten the ITIT capstone line to 3 lines and add a gap
  between it and Coursework; re-add Corne 42 to Projects, now noting the
  rotary encoders. Verified one page.
- Web resume mirrored: shortened ITIT line + Corne 42 with rotary encoders.

Co-Authored-By: Claude Opus 4.8 (1M context) <noreply@anthropic.com>
</commit_message>
<xml_diff>
--- a/public/Gabriel-Harlan-Resume.docx
+++ b/public/Gabriel-Harlan-Resume.docx
@@ -321,7 +321,7 @@
           </w:p>
           <w:p>
             <w:pPr>
-              <w:spacing w:after="18"/>
+              <w:spacing w:before="200" w:after="18"/>
               <w:ind w:left="230" w:hanging="230"/>
             </w:pPr>
             <w:r>
@@ -342,7 +342,7 @@
                 <w:color w:val="5A4F41"/>
                 <w:sz w:val="18"/>
               </w:rPr>
-              <w:t>ITIT — senior capstone: an IoT asset-tracking system that keeps hardware trackers and a web app in real-time sync, with a nested Deployments → Locations → Trackers → Items data model and CSV export to Excel.</w:t>
+              <w:t>ITIT — senior capstone: an IoT asset-tracking system that syncs hardware trackers with a web app, on a nested Deployments → Locations → Trackers → Items model with CSV export.</w:t>
             </w:r>
           </w:p>
           <w:p>
@@ -823,7 +823,7 @@
           </w:tcPr>
           <w:p>
             <w:pPr>
-              <w:spacing w:before="64" w:after="26"/>
+              <w:spacing w:before="400" w:after="90"/>
             </w:pPr>
             <w:r>
               <w:rPr>
@@ -848,7 +848,7 @@
           </w:p>
           <w:p>
             <w:pPr>
-              <w:spacing w:before="28" w:after="0"/>
+              <w:spacing w:before="120" w:after="0"/>
             </w:pPr>
             <w:r>
               <w:rPr>
@@ -878,7 +878,7 @@
           </w:p>
           <w:p>
             <w:pPr>
-              <w:spacing w:before="28" w:after="0"/>
+              <w:spacing w:before="120" w:after="0"/>
             </w:pPr>
             <w:r>
               <w:rPr>
@@ -908,7 +908,7 @@
           </w:p>
           <w:p>
             <w:pPr>
-              <w:spacing w:before="28" w:after="0"/>
+              <w:spacing w:before="120" w:after="0"/>
             </w:pPr>
             <w:r>
               <w:rPr>
@@ -938,7 +938,7 @@
           </w:p>
           <w:p>
             <w:pPr>
-              <w:spacing w:before="28" w:after="0"/>
+              <w:spacing w:before="120" w:after="0"/>
             </w:pPr>
             <w:r>
               <w:rPr>
@@ -968,7 +968,7 @@
           </w:p>
           <w:p>
             <w:pPr>
-              <w:spacing w:before="28" w:after="0"/>
+              <w:spacing w:before="120" w:after="0"/>
             </w:pPr>
             <w:r>
               <w:rPr>
@@ -998,7 +998,7 @@
           </w:p>
           <w:p>
             <w:pPr>
-              <w:spacing w:before="64" w:after="26"/>
+              <w:spacing w:before="400" w:after="90"/>
             </w:pPr>
             <w:r>
               <w:rPr>
@@ -1023,7 +1023,7 @@
           </w:p>
           <w:p>
             <w:pPr>
-              <w:spacing w:after="18"/>
+              <w:spacing w:after="70"/>
               <w:ind w:left="230" w:hanging="230"/>
             </w:pPr>
             <w:r>
@@ -1049,7 +1049,7 @@
           </w:p>
           <w:p>
             <w:pPr>
-              <w:spacing w:after="18"/>
+              <w:spacing w:after="70"/>
               <w:ind w:left="230" w:hanging="230"/>
             </w:pPr>
             <w:r>
@@ -1075,7 +1075,7 @@
           </w:p>
           <w:p>
             <w:pPr>
-              <w:spacing w:after="18"/>
+              <w:spacing w:after="70"/>
               <w:ind w:left="230" w:hanging="230"/>
             </w:pPr>
             <w:r>
@@ -1101,7 +1101,7 @@
           </w:p>
           <w:p>
             <w:pPr>
-              <w:spacing w:after="18"/>
+              <w:spacing w:after="70"/>
               <w:ind w:left="230" w:hanging="230"/>
             </w:pPr>
             <w:r>
@@ -1127,7 +1127,7 @@
           </w:p>
           <w:p>
             <w:pPr>
-              <w:spacing w:before="64" w:after="26"/>
+              <w:spacing w:before="400" w:after="90"/>
             </w:pPr>
             <w:r>
               <w:rPr>
@@ -1152,7 +1152,7 @@
           </w:p>
           <w:p>
             <w:pPr>
-              <w:spacing w:after="22"/>
+              <w:spacing w:after="80"/>
               <w:ind w:left="230" w:hanging="230"/>
             </w:pPr>
             <w:r>
@@ -1188,7 +1188,7 @@
           </w:p>
           <w:p>
             <w:pPr>
-              <w:spacing w:after="22"/>
+              <w:spacing w:after="80"/>
               <w:ind w:left="230" w:hanging="230"/>
             </w:pPr>
             <w:r>
@@ -1224,7 +1224,7 @@
           </w:p>
           <w:p>
             <w:pPr>
-              <w:spacing w:after="22"/>
+              <w:spacing w:after="80"/>
               <w:ind w:left="230" w:hanging="230"/>
             </w:pPr>
             <w:r>
@@ -1260,7 +1260,7 @@
           </w:p>
           <w:p>
             <w:pPr>
-              <w:spacing w:after="22"/>
+              <w:spacing w:after="80"/>
               <w:ind w:left="230" w:hanging="230"/>
             </w:pPr>
             <w:r>
@@ -1296,7 +1296,43 @@
           </w:p>
           <w:p>
             <w:pPr>
-              <w:spacing w:before="64" w:after="26"/>
+              <w:spacing w:after="80"/>
+              <w:ind w:left="230" w:hanging="230"/>
+            </w:pPr>
+            <w:r>
+              <w:rPr>
+                <w:rFonts w:ascii="Schibsted Grotesk" w:hAnsi="Schibsted Grotesk"/>
+                <w:b w:val="0"/>
+                <w:i w:val="0"/>
+                <w:color w:val="C08800"/>
+                <w:sz w:val="14"/>
+              </w:rPr>
+              <w:t xml:space="preserve">◆  </w:t>
+            </w:r>
+            <w:r>
+              <w:rPr>
+                <w:rFonts w:ascii="Schibsted Grotesk" w:hAnsi="Schibsted Grotesk"/>
+                <w:b/>
+                <w:i w:val="0"/>
+                <w:color w:val="211B14"/>
+                <w:sz w:val="18"/>
+              </w:rPr>
+              <w:t>Corne 42</w:t>
+            </w:r>
+            <w:r>
+              <w:rPr>
+                <w:rFonts w:ascii="Schibsted Grotesk" w:hAnsi="Schibsted Grotesk"/>
+                <w:b w:val="0"/>
+                <w:i w:val="0"/>
+                <w:color w:val="5A4F41"/>
+                <w:sz w:val="17"/>
+              </w:rPr>
+              <w:t xml:space="preserve"> — hand-built split wireless keyboard with rotary encoders (ZMK)</w:t>
+            </w:r>
+          </w:p>
+          <w:p>
+            <w:pPr>
+              <w:spacing w:before="400" w:after="90"/>
             </w:pPr>
             <w:r>
               <w:rPr>

</xml_diff>